<commit_message>
Revisión U07: RA6 oficial, fallo de vecindad corregido y ejercicios duplicados reescritos
</commit_message>
<xml_diff>
--- a/docx/07-ospf/07-ospf.docx
+++ b/docx/07-ospf/07-ospf.docx
@@ -101,7 +101,7 @@
           <w:i/>
           <w:iCs/>
         </w:rPr>
-        <w:t xml:space="preserve">Tu red crece: ya no hay dos routers, hay doce, con enlaces que se caen, caminos alternativos y planes de sucursales nuevas. Escribir rutas estáticas a mano se convierte en un trabajo de titánico con errores garantizados. ¿Y si los routers se contaran entre sí dónde está cada red y eligieran sus caminos solos? Eso es el enrutamiento dinámico, y OSPF es su estándar de facto en redes de empresa.</w:t>
+        <w:t xml:space="preserve">Tu red crece: ya no hay dos routers, hay doce, con enlaces que se caen, caminos alternativos y planes de sucursales nuevas. Escribir rutas estáticas a mano se convierte en un trabajo titánico con errores garantizados. ¿Y si los routers se contaran entre sí dónde está cada red y eligieran sus caminos solos? Eso es el enrutamiento dinámico, y OSPF es su estándar de facto en redes de empresa.</w:t>
       </w:r>
     </w:p>
     <w:p>
@@ -813,7 +813,7 @@
         <w:pStyle w:val="BlockText"/>
       </w:pPr>
       <w:r>
-        <w:t xml:space="preserve">Practica con los pares del curso: empezar siempre el resuelto para ver el estilo y luego intentar el por-resolver.</w:t>
+        <w:t xml:space="preserve">Practica con los pares del curso: mira 1-2 resueltos para coger el formato, luego intenta el por-resolver; consulta el resuelto solo cuando te atasques.</w:t>
       </w:r>
     </w:p>
     <w:p>
@@ -868,7 +868,7 @@
           <w:b/>
           <w:bCs/>
         </w:rPr>
-        <w:t xml:space="preserve">RA6: Aplica protocolos de encaminamiento dinámico en redes IP.</w:t>
+        <w:t xml:space="preserve">RA6: Realiza tareas avanzadas de administración de red analizando y utilizando protocolos dinámicos de encaminamiento.</w:t>
       </w:r>
     </w:p>
     <w:tbl>
@@ -929,29 +929,29 @@
               <w:pStyle w:val="Compact"/>
             </w:pPr>
             <w:r>
-              <w:t xml:space="preserve">a)</w:t>
-            </w:r>
-          </w:p>
-        </w:tc>
-        <w:tc>
-          <w:tcPr/>
-          <w:p>
-            <w:pPr>
-              <w:pStyle w:val="Compact"/>
-            </w:pPr>
-            <w:r>
-              <w:t xml:space="preserve">Ventajas del enrutamiento dinámico</w:t>
-            </w:r>
-          </w:p>
-        </w:tc>
-        <w:tc>
-          <w:tcPr/>
-          <w:p>
-            <w:pPr>
-              <w:pStyle w:val="Compact"/>
-            </w:pPr>
-            <w:r>
-              <w:t xml:space="preserve">✅ Punto 1</w:t>
+              <w:t xml:space="preserve">g)</w:t>
+            </w:r>
+          </w:p>
+        </w:tc>
+        <w:tc>
+          <w:tcPr/>
+          <w:p>
+            <w:pPr>
+              <w:pStyle w:val="Compact"/>
+            </w:pPr>
+            <w:r>
+              <w:t xml:space="preserve">Configuración y uso de OSPF en un router</w:t>
+            </w:r>
+          </w:p>
+        </w:tc>
+        <w:tc>
+          <w:tcPr/>
+          <w:p>
+            <w:pPr>
+              <w:pStyle w:val="Compact"/>
+            </w:pPr>
+            <w:r>
+              <w:t xml:space="preserve">✅ Puntos 6-7 + ⚡ Laboratorio (punto 9)</w:t>
             </w:r>
           </w:p>
         </w:tc>
@@ -964,29 +964,29 @@
               <w:pStyle w:val="Compact"/>
             </w:pPr>
             <w:r>
-              <w:t xml:space="preserve">b)</w:t>
-            </w:r>
-          </w:p>
-        </w:tc>
-        <w:tc>
-          <w:tcPr/>
-          <w:p>
-            <w:pPr>
-              <w:pStyle w:val="Compact"/>
-            </w:pPr>
-            <w:r>
-              <w:t xml:space="preserve">Clasificación de protocolos (IGP/EGP, estado de enlace)</w:t>
-            </w:r>
-          </w:p>
-        </w:tc>
-        <w:tc>
-          <w:tcPr/>
-          <w:p>
-            <w:pPr>
-              <w:pStyle w:val="Compact"/>
-            </w:pPr>
-            <w:r>
-              <w:t xml:space="preserve">✅ Punto 2</w:t>
+              <w:t xml:space="preserve">h)</w:t>
+            </w:r>
+          </w:p>
+        </w:tc>
+        <w:tc>
+          <w:tcPr/>
+          <w:p>
+            <w:pPr>
+              <w:pStyle w:val="Compact"/>
+            </w:pPr>
+            <w:r>
+              <w:t xml:space="preserve">Ruta por defecto con OSPF</w:t>
+            </w:r>
+          </w:p>
+        </w:tc>
+        <w:tc>
+          <w:tcPr/>
+          <w:p>
+            <w:pPr>
+              <w:pStyle w:val="Compact"/>
+            </w:pPr>
+            <w:r>
+              <w:t xml:space="preserve">✅ Punto 8 + ⚡ Laboratorio (punto 9)</w:t>
             </w:r>
           </w:p>
         </w:tc>
@@ -999,88 +999,18 @@
               <w:pStyle w:val="Compact"/>
             </w:pPr>
             <w:r>
-              <w:t xml:space="preserve">c)</w:t>
-            </w:r>
-          </w:p>
-        </w:tc>
-        <w:tc>
-          <w:tcPr/>
-          <w:p>
-            <w:pPr>
-              <w:pStyle w:val="Compact"/>
-            </w:pPr>
-            <w:r>
-              <w:t xml:space="preserve">Funcionamiento de OSPF</w:t>
-            </w:r>
-          </w:p>
-        </w:tc>
-        <w:tc>
-          <w:tcPr/>
-          <w:p>
-            <w:pPr>
-              <w:pStyle w:val="Compact"/>
-            </w:pPr>
-            <w:r>
-              <w:t xml:space="preserve">✅ Puntos 3-6 + ⚡ Laboratorio (punto 9)</w:t>
-            </w:r>
-          </w:p>
-        </w:tc>
-      </w:tr>
-      <w:tr>
-        <w:tc>
-          <w:tcPr/>
-          <w:p>
-            <w:pPr>
-              <w:pStyle w:val="Compact"/>
-            </w:pPr>
-            <w:r>
-              <w:t xml:space="preserve">d)</w:t>
-            </w:r>
-          </w:p>
-        </w:tc>
-        <w:tc>
-          <w:tcPr/>
-          <w:p>
-            <w:pPr>
-              <w:pStyle w:val="Compact"/>
-            </w:pPr>
-            <w:r>
-              <w:t xml:space="preserve">Configuración de OSPF</w:t>
-            </w:r>
-          </w:p>
-        </w:tc>
-        <w:tc>
-          <w:tcPr/>
-          <w:p>
-            <w:pPr>
-              <w:pStyle w:val="Compact"/>
-            </w:pPr>
-            <w:r>
-              <w:t xml:space="preserve">✅ Puntos 7-8 + ⚡ Laboratorio (punto 9)</w:t>
-            </w:r>
-          </w:p>
-        </w:tc>
-      </w:tr>
-      <w:tr>
-        <w:tc>
-          <w:tcPr/>
-          <w:p>
-            <w:pPr>
-              <w:pStyle w:val="Compact"/>
-            </w:pPr>
-            <w:r>
-              <w:t xml:space="preserve">e)</w:t>
-            </w:r>
-          </w:p>
-        </w:tc>
-        <w:tc>
-          <w:tcPr/>
-          <w:p>
-            <w:pPr>
-              <w:pStyle w:val="Compact"/>
-            </w:pPr>
-            <w:r>
-              <w:t xml:space="preserve">Verificación y diagnóstico</w:t>
+              <w:t xml:space="preserve">i)</w:t>
+            </w:r>
+          </w:p>
+        </w:tc>
+        <w:tc>
+          <w:tcPr/>
+          <w:p>
+            <w:pPr>
+              <w:pStyle w:val="Compact"/>
+            </w:pPr>
+            <w:r>
+              <w:t xml:space="preserve">Diagnóstico de incidencias en el encaminamiento</w:t>
             </w:r>
           </w:p>
         </w:tc>
@@ -2398,96 +2328,42 @@
       </w:pPr>
       <w:r>
         <w:rPr>
+          <w:rStyle w:val="CommentTok"/>
+        </w:rPr>
+        <w:t xml:space="preserve"># Ruta principal: 0.0.0.0/0 aprendida por OSPF (AD 110)</w:t>
+      </w:r>
+      <w:r>
+        <w:br/>
+      </w:r>
+      <w:r>
+        <w:rPr>
+          <w:rStyle w:val="ExtensionTok"/>
+        </w:rPr>
+        <w:t xml:space="preserve">R1</w:t>
+      </w:r>
+      <w:r>
+        <w:rPr>
+          <w:rStyle w:val="ErrorTok"/>
+        </w:rPr>
+        <w:t xml:space="preserve">(</w:t>
+      </w:r>
+      <w:r>
+        <w:rPr>
+          <w:rStyle w:val="ExtensionTok"/>
+        </w:rPr>
+        <w:t xml:space="preserve">config</w:t>
+      </w:r>
+      <w:r>
+        <w:rPr>
           <w:rStyle w:val="KeywordTok"/>
         </w:rPr>
-        <w:t xml:space="preserve">;</w:t>
-      </w:r>
-      <w:r>
-        <w:rPr>
-          <w:rStyle w:val="NormalTok"/>
-        </w:rPr>
-        <w:t xml:space="preserve"> </w:t>
-      </w:r>
-      <w:r>
-        <w:rPr>
-          <w:rStyle w:val="ExtensionTok"/>
-        </w:rPr>
-        <w:t xml:space="preserve">Ruta</w:t>
-      </w:r>
-      <w:r>
-        <w:rPr>
-          <w:rStyle w:val="NormalTok"/>
-        </w:rPr>
-        <w:t xml:space="preserve"> principal: 0.0.0.0/0 aprendida por OSPF </w:t>
-      </w:r>
-      <w:r>
-        <w:rPr>
-          <w:rStyle w:val="ErrorTok"/>
-        </w:rPr>
-        <w:t xml:space="preserve">(</w:t>
-      </w:r>
-      <w:r>
-        <w:rPr>
-          <w:rStyle w:val="ExtensionTok"/>
-        </w:rPr>
-        <w:t xml:space="preserve">AD</w:t>
-      </w:r>
-      <w:r>
-        <w:rPr>
-          <w:rStyle w:val="NormalTok"/>
-        </w:rPr>
-        <w:t xml:space="preserve"> 110, ver [punto 8]</w:t>
-      </w:r>
-      <w:r>
-        <w:rPr>
-          <w:rStyle w:val="ErrorTok"/>
-        </w:rPr>
-        <w:t xml:space="preserve">(</w:t>
-      </w:r>
-      <w:r>
-        <w:rPr>
-          <w:rStyle w:val="ExtensionTok"/>
-        </w:rPr>
-        <w:t xml:space="preserve">/ApuntesRedes/07-ospf/08-ruta-por-defecto-y-diagnostico</w:t>
-      </w:r>
-      <w:r>
-        <w:rPr>
-          <w:rStyle w:val="KeywordTok"/>
-        </w:rPr>
-        <w:t xml:space="preserve">))</w:t>
-      </w:r>
-      <w:r>
-        <w:br/>
-      </w:r>
-      <w:r>
-        <w:rPr>
-          <w:rStyle w:val="ExtensionTok"/>
-        </w:rPr>
-        <w:t xml:space="preserve">R1</w:t>
-      </w:r>
-      <w:r>
-        <w:rPr>
-          <w:rStyle w:val="ErrorTok"/>
-        </w:rPr>
-        <w:t xml:space="preserve">(</w:t>
-      </w:r>
-      <w:r>
-        <w:rPr>
-          <w:rStyle w:val="ExtensionTok"/>
-        </w:rPr>
-        <w:t xml:space="preserve">config</w:t>
-      </w:r>
-      <w:r>
-        <w:rPr>
-          <w:rStyle w:val="KeywordTok"/>
-        </w:rPr>
         <w:t xml:space="preserve">)</w:t>
       </w:r>
       <w:r>
         <w:rPr>
           <w:rStyle w:val="CommentTok"/>
         </w:rPr>
-        <w:t xml:space="preserve"># ip route 0.0.0.0 0.0.0.0 10.0.0.254 150      ; respaldo estático, AD 150 &gt; 110</w:t>
+        <w:t xml:space="preserve"># ip route 0.0.0.0 0.0.0.0 10.0.0.254 150      # respaldo estático, AD 150 &gt; 110</w:t>
       </w:r>
     </w:p>
     <w:p>
@@ -2498,7 +2374,21 @@
         </w:numPr>
       </w:pPr>
       <w:r>
-        <w:t xml:space="preserve">Mientras el enlace principal viva, OSPF gana (menor AD) y el respaldo espera en silencio. Si cae, la estática entra sola.</w:t>
+        <w:t xml:space="preserve">Mientras el enlace principal viva, OSPF gana (menor AD) y el respaldo espera en silencio; si cae, la estática entra sola (el detalle de la default por OSPF está en el</w:t>
+      </w:r>
+      <w:r>
+        <w:t xml:space="preserve"> </w:t>
+      </w:r>
+      <w:hyperlink r:id="rId18">
+        <w:r>
+          <w:rPr>
+            <w:rStyle w:val="Hyperlink"/>
+          </w:rPr>
+          <w:t xml:space="preserve">punto 8</w:t>
+        </w:r>
+      </w:hyperlink>
+      <w:r>
+        <w:t xml:space="preserve">).</w:t>
       </w:r>
     </w:p>
     <w:p>
@@ -7523,7 +7413,7 @@
         <w:rPr>
           <w:rStyle w:val="VerbatimChar"/>
         </w:rPr>
-        <w:t xml:space="preserve">    (ASBR: redistribuye esa red a OSPF)</w:t>
+        <w:t xml:space="preserve">    (Área 0 · ASBR: redistribuye esa red a OSPF)</w:t>
       </w:r>
     </w:p>
     <w:p>
@@ -7620,7 +7510,20 @@
         <w:t xml:space="preserve"> </w:t>
       </w:r>
       <w:r>
-        <w:t xml:space="preserve">(introduce la ruta estática en OSPF) y backbone router.</w:t>
+        <w:t xml:space="preserve">(introduce la ruta estática en OSPF); como está en el Área 0, también es</w:t>
+      </w:r>
+      <w:r>
+        <w:t xml:space="preserve"> </w:t>
+      </w:r>
+      <w:r>
+        <w:rPr>
+          <w:i/>
+          <w:iCs/>
+        </w:rPr>
+        <w:t xml:space="preserve">backbone router</w:t>
+      </w:r>
+      <w:r>
+        <w:t xml:space="preserve">.</w:t>
       </w:r>
     </w:p>
     <w:p>
@@ -8400,7 +8303,7 @@
         <w:rPr>
           <w:rStyle w:val="VerbatimChar"/>
         </w:rPr>
-        <w:t xml:space="preserve">Sin DR → 5*4/2 = 10 adyacencias       Con DR → 5-1 = 4 adyacencias</w:t>
+        <w:t xml:space="preserve">Sin DR → 5*4/2 = 10 adyacencias       Con DR y BDR → 2*5-3 = 7 adyacencias</w:t>
       </w:r>
       <w:r>
         <w:br/>
@@ -8799,13 +8702,13 @@
           <w:b/>
           <w:bCs/>
         </w:rPr>
-        <w:t xml:space="preserve">La elección solo ocurre al arrancar</w:t>
-      </w:r>
-      <w:r>
-        <w:t xml:space="preserve"> </w:t>
-      </w:r>
-      <w:r>
-        <w:t xml:space="preserve">OSPF (o al reiniciar el proceso). Cambiar prioridades a mitad de partida no destrona al DR existente: hay que reiniciar.</w:t>
+        <w:t xml:space="preserve">La elección se hace al arrancar OSPF, al reiniciar el proceso o cuando falla el DR</w:t>
+      </w:r>
+      <w:r>
+        <w:t xml:space="preserve"> </w:t>
+      </w:r>
+      <w:r>
+        <w:t xml:space="preserve">(entonces el BDR asciende y se elige un nuevo BDR). Cambiar prioridades a mitad de partida no destrona al DR existente: hay que reiniciar.</w:t>
       </w:r>
     </w:p>
     <w:p>
@@ -9366,13 +9269,13 @@
           <w:b/>
           <w:bCs/>
         </w:rPr>
-        <w:t xml:space="preserve">Con solo el DR, 5 adyacencias</w:t>
-      </w:r>
-      <w:r>
-        <w:t xml:space="preserve"> </w:t>
-      </w:r>
-      <w:r>
-        <w:t xml:space="preserve">(N-1); contando también el BDR, 2N-3 = 9 (cada router con el DR y con el BDR). La cuenta clásica de examen es 2N-3.ctica son con DR y BDR).</w:t>
+        <w:t xml:space="preserve">9 adyacencias</w:t>
+      </w:r>
+      <w:r>
+        <w:t xml:space="preserve"> </w:t>
+      </w:r>
+      <w:r>
+        <w:t xml:space="preserve">(2N−3 con N = 6): cada router forma adyacencia con el DR y con el BDR. Si solo contaras las adyacencias del DR serían N−1 = 5.</w:t>
       </w:r>
     </w:p>
     <w:p>
@@ -9477,7 +9380,23 @@
         <w:t xml:space="preserve">BDR</w:t>
       </w:r>
       <w:r>
-        <w:t xml:space="preserve">) reduce las adyacencias de N(N-1)/2 a N-1 en cada segmento multiacceso.</w:t>
+        <w:t xml:space="preserve">) reduce las adyacencias de N(N-1)/2 a</w:t>
+      </w:r>
+      <w:r>
+        <w:t xml:space="preserve"> </w:t>
+      </w:r>
+      <w:r>
+        <w:rPr>
+          <w:b/>
+          <w:bCs/>
+        </w:rPr>
+        <w:t xml:space="preserve">2N-3</w:t>
+      </w:r>
+      <w:r>
+        <w:t xml:space="preserve"> </w:t>
+      </w:r>
+      <w:r>
+        <w:t xml:space="preserve">con DR y BDR en cada segmento multiacceso.</w:t>
       </w:r>
     </w:p>
     <w:p>
@@ -10456,7 +10375,7 @@
         <w:rPr>
           <w:rStyle w:val="VerbatimChar"/>
         </w:rPr>
-        <w:t xml:space="preserve">           1</w:t>
+        <w:t xml:space="preserve">           1        (costes: A-C=5, A-B=5, B-D=2, C-D=1)</w:t>
       </w:r>
     </w:p>
     <w:p>
@@ -10645,7 +10564,7 @@
         <w:rPr>
           <w:rStyle w:val="CommentTok"/>
         </w:rPr>
-        <w:t xml:space="preserve"># auto-cost reference-bandwidth 1000   ; 1 Gbps como coste 1</w:t>
+        <w:t xml:space="preserve"># auto-cost reference-bandwidth 1000   # 1 Gbps como coste 1</w:t>
       </w:r>
     </w:p>
     <w:p>
@@ -10748,16 +10667,19 @@
         <w:rPr>
           <w:rStyle w:val="VerbatimChar"/>
         </w:rPr>
-        <w:t xml:space="preserve">                    R2</w:t>
+        <w:t xml:space="preserve">        Camino A · FastEthernet 100 Mbps (coste 1 por enlace)</w:t>
       </w:r>
       <w:r>
         <w:br/>
       </w:r>
       <w:r>
+        <w:br/>
+      </w:r>
+      <w:r>
         <w:rPr>
           <w:rStyle w:val="VerbatimChar"/>
         </w:rPr>
-        <w:t xml:space="preserve">              ┌──────────┐</w:t>
+        <w:t xml:space="preserve">   LAN ── R1 ─────────── R2 ─────────── R3 ── LAN</w:t>
       </w:r>
       <w:r>
         <w:br/>
@@ -10766,25 +10688,31 @@
         <w:rPr>
           <w:rStyle w:val="VerbatimChar"/>
         </w:rPr>
-        <w:t xml:space="preserve">LAN ── R1 ─┤ FastEth ├── R3 ── LAN</w:t>
+        <w:t xml:space="preserve">                      100 Mbps      100 Mbps</w:t>
       </w:r>
       <w:r>
         <w:br/>
       </w:r>
       <w:r>
+        <w:br/>
+      </w:r>
+      <w:r>
         <w:rPr>
           <w:rStyle w:val="VerbatimChar"/>
         </w:rPr>
-        <w:t xml:space="preserve">               │  100Mbps │  100Mbps</w:t>
+        <w:t xml:space="preserve">        Camino B · Serial 10 Mbps (coste 10 por enlace)</w:t>
       </w:r>
       <w:r>
         <w:br/>
       </w:r>
       <w:r>
+        <w:br/>
+      </w:r>
+      <w:r>
         <w:rPr>
           <w:rStyle w:val="VerbatimChar"/>
         </w:rPr>
-        <w:t xml:space="preserve">              └──────────┘</w:t>
+        <w:t xml:space="preserve">   R1 ─────────── R4 ─────────── R3</w:t>
       </w:r>
       <w:r>
         <w:br/>
@@ -10793,7 +10721,7 @@
         <w:rPr>
           <w:rStyle w:val="VerbatimChar"/>
         </w:rPr>
-        <w:t xml:space="preserve">   R1 ─── R4 ─── R3     (todo el camino por 10 Mbps)</w:t>
+        <w:t xml:space="preserve">               10 Mbps      10 Mbps</w:t>
       </w:r>
     </w:p>
     <w:p>
@@ -10877,7 +10805,7 @@
         <w:t xml:space="preserve"> </w:t>
       </w:r>
       <w:r>
-        <w:t xml:space="preserve">(coste 2 &lt; 20), aunque los dos caminos tengan el mismo número de saltos. Y ahora el truco del administrador: si la fibra de R2 está saturada y queremos mover tráfico por R4 aunque sea lento, subimos el coste de las interfaces de R2:</w:t>
+        <w:t xml:space="preserve">(coste 2 &lt; 20), aunque los dos caminos tengan el mismo número de saltos. Y ahora el truco del administrador: si el enlace de R2 está saturado y queremos mover tráfico por R4 aunque sea lento, subimos el coste de las interfaces de R2:</w:t>
       </w:r>
     </w:p>
     <w:p>
@@ -10900,6 +10828,39 @@
         <w:rPr>
           <w:rStyle w:val="ExtensionTok"/>
         </w:rPr>
+        <w:t xml:space="preserve">config</w:t>
+      </w:r>
+      <w:r>
+        <w:rPr>
+          <w:rStyle w:val="KeywordTok"/>
+        </w:rPr>
+        <w:t xml:space="preserve">)</w:t>
+      </w:r>
+      <w:r>
+        <w:rPr>
+          <w:rStyle w:val="CommentTok"/>
+        </w:rPr>
+        <w:t xml:space="preserve"># interface gigabitethernet 0/0</w:t>
+      </w:r>
+      <w:r>
+        <w:br/>
+      </w:r>
+      <w:r>
+        <w:rPr>
+          <w:rStyle w:val="ExtensionTok"/>
+        </w:rPr>
+        <w:t xml:space="preserve">R1</w:t>
+      </w:r>
+      <w:r>
+        <w:rPr>
+          <w:rStyle w:val="ErrorTok"/>
+        </w:rPr>
+        <w:t xml:space="preserve">(</w:t>
+      </w:r>
+      <w:r>
+        <w:rPr>
+          <w:rStyle w:val="ExtensionTok"/>
+        </w:rPr>
         <w:t xml:space="preserve">config-if</w:t>
       </w:r>
       <w:r>
@@ -10912,40 +10873,7 @@
         <w:rPr>
           <w:rStyle w:val="CommentTok"/>
         </w:rPr>
-        <w:t xml:space="preserve"># interface gigabitethernet 0/0</w:t>
-      </w:r>
-      <w:r>
-        <w:br/>
-      </w:r>
-      <w:r>
-        <w:rPr>
-          <w:rStyle w:val="ExtensionTok"/>
-        </w:rPr>
-        <w:t xml:space="preserve">R1</w:t>
-      </w:r>
-      <w:r>
-        <w:rPr>
-          <w:rStyle w:val="ErrorTok"/>
-        </w:rPr>
-        <w:t xml:space="preserve">(</w:t>
-      </w:r>
-      <w:r>
-        <w:rPr>
-          <w:rStyle w:val="ExtensionTok"/>
-        </w:rPr>
-        <w:t xml:space="preserve">config-if</w:t>
-      </w:r>
-      <w:r>
-        <w:rPr>
-          <w:rStyle w:val="KeywordTok"/>
-        </w:rPr>
-        <w:t xml:space="preserve">)</w:t>
-      </w:r>
-      <w:r>
-        <w:rPr>
-          <w:rStyle w:val="CommentTok"/>
-        </w:rPr>
-        <w:t xml:space="preserve"># ip ospf cost 50          ; Camino A pasa a coste 50+1 = 51 &gt; 20</w:t>
+        <w:t xml:space="preserve"># ip ospf cost 50          # Camino A pasa a coste 50+1 = 51 &gt; 20</w:t>
       </w:r>
     </w:p>
     <w:p>
@@ -11996,7 +11924,7 @@
         <w:t xml:space="preserve">área</w:t>
       </w:r>
       <w:r>
-        <w:t xml:space="preserve">. OSPF activará OSPF en las interfaces que caigan dentro de esa red.</w:t>
+        <w:t xml:space="preserve">. OSPF activará la negociación en las interfaces cuyas direcciones caigan dentro de esa red.</w:t>
       </w:r>
     </w:p>
     <w:p>
@@ -13524,7 +13452,7 @@
         <w:rPr>
           <w:rStyle w:val="CommentTok"/>
         </w:rPr>
-        <w:t xml:space="preserve"># ip route 0.0.0.0 0.0.0.0 serial 0/0/0    ; ruta por defecto local</w:t>
+        <w:t xml:space="preserve"># ip route 0.0.0.0 0.0.0.0 serial 0/0/0    # ruta por defecto local</w:t>
       </w:r>
       <w:r>
         <w:br/>
@@ -13590,7 +13518,7 @@
         <w:rPr>
           <w:rStyle w:val="CommentTok"/>
         </w:rPr>
-        <w:t xml:space="preserve"># default-information originate     ; la anuncia a OSPF</w:t>
+        <w:t xml:space="preserve"># default-information originate     # la anuncia a OSPF</w:t>
       </w:r>
     </w:p>
     <w:p>
@@ -14629,7 +14557,22 @@
               <w:pStyle w:val="Compact"/>
             </w:pPr>
             <w:r>
-              <w:t xml:space="preserve">Ruta</w:t>
+              <w:t xml:space="preserve">Ruta externa con</w:t>
+            </w:r>
+            <w:r>
+              <w:t xml:space="preserve"> </w:t>
+            </w:r>
+            <w:r>
+              <w:rPr>
+                <w:rStyle w:val="VerbatimChar"/>
+              </w:rPr>
+              <w:t xml:space="preserve">*</w:t>
+            </w:r>
+            <w:r>
+              <w:t xml:space="preserve"> </w:t>
+            </w:r>
+            <w:r>
+              <w:t xml:space="preserve">de</w:t>
             </w:r>
             <w:r>
               <w:t xml:space="preserve"> </w:t>
@@ -14639,13 +14582,13 @@
                 <w:b/>
                 <w:bCs/>
               </w:rPr>
-              <w:t xml:space="preserve">externa</w:t>
+              <w:t xml:space="preserve">candidata a ruta por defecto</w:t>
             </w:r>
             <w:r>
               <w:t xml:space="preserve"> </w:t>
             </w:r>
             <w:r>
-              <w:t xml:space="preserve">(la ruta por defecto del ASBR: predeterminada E2)</w:t>
+              <w:t xml:space="preserve">(la default que anuncia el ASBR, tipo E2)</w:t>
             </w:r>
           </w:p>
         </w:tc>
@@ -14744,7 +14687,7 @@
         <w:rPr>
           <w:rStyle w:val="VerbatimChar"/>
         </w:rPr>
-        <w:t xml:space="preserve">     10.1.0.0/24 [110/2] via 10.0.0.2, 00:12:03, GigabitEthernet0/0</w:t>
+        <w:t xml:space="preserve">O    10.1.0.0/24 [110/2] via 10.0.0.2, 00:12:03, GigabitEthernet0/0</w:t>
       </w:r>
       <w:r>
         <w:br/>
@@ -16927,16 +16870,59 @@
         <w:t xml:space="preserve"> </w:t>
       </w:r>
       <w:r>
-        <w:t xml:space="preserve">deben pasar por el Área 0: sin conexión al backbone, los routers de las áreas 1 y 2 no intercambiarán rutas entre sí, aunque sean vecinos directos en el enlace físico. Verás los vecinos en el enlace directo (R3-R4) en estado FULL, pero sin rutas de la otra área en la tabla (</w:t>
+        <w:t xml:space="preserve">deben pasar por el Área 0. Además, como cada extremo queda declarado en un área distinta,</w:t>
+      </w:r>
+      <w:r>
+        <w:t xml:space="preserve"> </w:t>
+      </w:r>
+      <w:r>
+        <w:rPr>
+          <w:b/>
+          <w:bCs/>
+        </w:rPr>
+        <w:t xml:space="preserve">ni siquiera forman vecindad</w:t>
+      </w:r>
+      <w:r>
+        <w:t xml:space="preserve">:</w:t>
+      </w:r>
+      <w:r>
+        <w:t xml:space="preserve"> </w:t>
       </w:r>
       <w:r>
         <w:rPr>
           <w:rStyle w:val="VerbatimChar"/>
         </w:rPr>
+        <w:t xml:space="preserve">show ip ospf neighbor</w:t>
+      </w:r>
+      <w:r>
+        <w:t xml:space="preserve"> </w:t>
+      </w:r>
+      <w:r>
+        <w:t xml:space="preserve">no mostrará al otro router en ese enlace. Y si algún listo declara ambos extremos en la misma área para</w:t>
+      </w:r>
+      <w:r>
+        <w:t xml:space="preserve"> </w:t>
+      </w:r>
+      <w:r>
+        <w:t xml:space="preserve">“arreglarlo”</w:t>
+      </w:r>
+      <w:r>
+        <w:t xml:space="preserve"> </w:t>
+      </w:r>
+      <w:r>
+        <w:t xml:space="preserve">y llegan a FULL, seguirá sin haber intercambio: el Área 2 no vuelca sus rutas en el Área 1 sin pasar por el backbone. Compruébalo con</w:t>
+      </w:r>
+      <w:r>
+        <w:t xml:space="preserve"> </w:t>
+      </w:r>
+      <w:r>
+        <w:rPr>
+          <w:rStyle w:val="VerbatimChar"/>
+        </w:rPr>
         <w:t xml:space="preserve">show ip route ospf</w:t>
       </w:r>
       <w:r>
-        <w:t xml:space="preserve">).</w:t>
+        <w:t xml:space="preserve">: no verás las rutas de la otra área.</w:t>
       </w:r>
     </w:p>
     <w:p>
@@ -17971,23 +17957,23 @@
         <w:pStyle w:val="FirstParagraph"/>
       </w:pPr>
       <w:r>
-        <w:t xml:space="preserve">Sí, mientras no se reinicie el proceso. La elección de DR/BDR solo ocurre</w:t>
-      </w:r>
-      <w:r>
-        <w:t xml:space="preserve"> </w:t>
-      </w:r>
-      <w:r>
-        <w:rPr>
-          <w:b/>
-          <w:bCs/>
-        </w:rPr>
-        <w:t xml:space="preserve">al arrancar OSPF o al reiniciarlo</w:t>
-      </w:r>
-      <w:r>
-        <w:t xml:space="preserve"> </w:t>
-      </w:r>
-      <w:r>
-        <w:t xml:space="preserve">(lo viste en el</w:t>
+        <w:t xml:space="preserve">Sí, mientras no se reinicie el proceso ni caiga el DR. La elección de DR/BDR se decide</w:t>
+      </w:r>
+      <w:r>
+        <w:t xml:space="preserve"> </w:t>
+      </w:r>
+      <w:r>
+        <w:rPr>
+          <w:b/>
+          <w:bCs/>
+        </w:rPr>
+        <w:t xml:space="preserve">al arrancar OSPF, al reiniciar el proceso o cuando falla el DR</w:t>
+      </w:r>
+      <w:r>
+        <w:t xml:space="preserve"> </w:t>
+      </w:r>
+      <w:r>
+        <w:t xml:space="preserve">(entonces el BDR asciende y se elige un nuevo BDR) (lo viste en el</w:t>
       </w:r>
       <w:r>
         <w:t xml:space="preserve"> </w:t>

</xml_diff>